<commit_message>
docs: lanceerinstallatie naar split-collar cable-tie, met onderbouwing van de keuze
</commit_message>
<xml_diff>
--- a/docs/PWS_Waterraket_Lanceerinstallatie.docx
+++ b/docs/PWS_Waterraket_Lanceerinstallatie.docx
@@ -21,7 +21,7 @@
           <w:i/>
           <w:iCs/>
         </w:rPr>
-        <w:t xml:space="preserve">Bouwtekening en onderdelenlijst – Clark cable-tie / Gardena-ontwerp met manometer en aftapventiel.</w:t>
+        <w:t xml:space="preserve">Bouwtekening en onderdelenlijst – Split-collar cable-tie ontwerp met manometer en aftapventiel.</w:t>
       </w:r>
     </w:p>
     <w:p>
@@ -43,7 +43,7 @@
           <w:i w:val="false"/>
           <w:iCs w:val="false"/>
         </w:rPr>
-        <w:t xml:space="preserve">De installatie is gebaseerd op de Clark cable-tie launcher: kabelbinders (cable ties) rondom de flessenhals grijpen de flens, en een schuifkraag (release-ring) houdt ze vast. Via een trekkoord trek je die kraag vanaf veilige afstand omlaag, waarna de raket loskomt. Het cable-tie-principe is bedacht door Ian Clark en geldt als het de-facto standaardontwerp omdat het betrouwbaar en eenvoudig te maken is. De release past op een standaard Gardena-koppeling, zodat je dezelfde kop met meerdere launchers kunt gebruiken.</w:t>
+        <w:t xml:space="preserve">De installatie is gebaseerd op de Clark cable-tie launcher: kabelbinders (cable ties) rondom de flessenhals grijpen de flens, en een in twee helften gedeelde kraag houdt ze vast. Via een trekkoord trek je die kraag vanaf veilige afstand omlaag, waarna de raket loskomt. Het cable-tie-principe is bedacht door Ian Clark en geldt als het de-facto standaardontwerp omdat het betrouwbaar en eenvoudig te maken is. De release past op een standaard Gardena-koppeling, zodat je dezelfde kop met meerdere launchers kunt gebruiken.</w:t>
       </w:r>
     </w:p>
     <w:p>
@@ -467,7 +467,7 @@
                 <w:b w:val="false"/>
                 <w:bCs w:val="false"/>
               </w:rPr>
-              <w:t xml:space="preserve">Release-kraag</w:t>
+              <w:t xml:space="preserve">Gedeelde kraag (twee helften)</w:t>
             </w:r>
           </w:p>
         </w:tc>
@@ -493,7 +493,7 @@
                 <w:b w:val="false"/>
                 <w:bCs w:val="false"/>
               </w:rPr>
-              <w:t xml:space="preserve">stuk PVC-buis dat over de ties schuift</w:t>
+              <w:t xml:space="preserve">PVC-buis over de ties, in de lengte doormidden gezaagd</w:t>
             </w:r>
           </w:p>
         </w:tc>
@@ -1127,7 +1127,7 @@
                 <w:b w:val="false"/>
                 <w:bCs w:val="false"/>
               </w:rPr>
-              <w:t xml:space="preserve">Gardena-slangkoppeling</w:t>
+              <w:t xml:space="preserve">Zelfklemtang (locking pliers)</w:t>
             </w:r>
           </w:p>
         </w:tc>
@@ -1153,7 +1153,7 @@
                 <w:b w:val="false"/>
                 <w:bCs w:val="false"/>
               </w:rPr>
-              <w:t xml:space="preserve">release head (alternatief/aanvulling)</w:t>
+              <w:t xml:space="preserve">houdt de kraaghelften dicht; trekkoord aan het ontgrendellipje</w:t>
             </w:r>
           </w:p>
         </w:tc>
@@ -1205,7 +1205,7 @@
                 <w:b w:val="false"/>
                 <w:bCs w:val="false"/>
               </w:rPr>
-              <w:t xml:space="preserve">tuincentrum</w:t>
+              <w:t xml:space="preserve">gereedschapswinkel</w:t>
             </w:r>
           </w:p>
         </w:tc>

</xml_diff>